<commit_message>
Update thesis chapters with results, conclusions, acknowledgements, and cover page enhancements
</commit_message>
<xml_diff>
--- a/thesis/sources/Portada-TFG.docx
+++ b/thesis/sources/Portada-TFG.docx
@@ -1,6 +1,6 @@
 
 <file path=word/document.xml><?xml version="1.0" encoding="utf-8"?>
-<w:document xmlns:wpc="http://schemas.microsoft.com/office/word/2010/wordprocessingCanvas" xmlns:cx="http://schemas.microsoft.com/office/drawing/2014/chartex" xmlns:mc="http://schemas.openxmlformats.org/markup-compatibility/2006" xmlns:o="urn:schemas-microsoft-com:office:office" xmlns:r="http://schemas.openxmlformats.org/officeDocument/2006/relationships" xmlns:m="http://schemas.openxmlformats.org/officeDocument/2006/math" xmlns:v="urn:schemas-microsoft-com:vml" xmlns:wp14="http://schemas.microsoft.com/office/word/2010/wordprocessingDrawing" xmlns:wp="http://schemas.openxmlformats.org/drawingml/2006/wordprocessingDrawing" xmlns:w10="urn:schemas-microsoft-com:office:word" xmlns:w="http://schemas.openxmlformats.org/wordprocessingml/2006/main" xmlns:w14="http://schemas.microsoft.com/office/word/2010/wordml" xmlns:w15="http://schemas.microsoft.com/office/word/2012/wordml" xmlns:w16se="http://schemas.microsoft.com/office/word/2015/wordml/symex" xmlns:wpg="http://schemas.microsoft.com/office/word/2010/wordprocessingGroup" xmlns:wpi="http://schemas.microsoft.com/office/word/2010/wordprocessingInk" xmlns:wne="http://schemas.microsoft.com/office/word/2006/wordml" xmlns:wps="http://schemas.microsoft.com/office/word/2010/wordprocessingShape" mc:Ignorable="w14 w15 w16se wp14">
+<w:document xmlns:wpc="http://schemas.microsoft.com/office/word/2010/wordprocessingCanvas" xmlns:cx="http://schemas.microsoft.com/office/drawing/2014/chartex" xmlns:cx1="http://schemas.microsoft.com/office/drawing/2015/9/8/chartex" xmlns:cx2="http://schemas.microsoft.com/office/drawing/2015/10/21/chartex" xmlns:cx3="http://schemas.microsoft.com/office/drawing/2016/5/9/chartex" xmlns:cx4="http://schemas.microsoft.com/office/drawing/2016/5/10/chartex" xmlns:cx5="http://schemas.microsoft.com/office/drawing/2016/5/11/chartex" xmlns:cx6="http://schemas.microsoft.com/office/drawing/2016/5/12/chartex" xmlns:cx7="http://schemas.microsoft.com/office/drawing/2016/5/13/chartex" xmlns:cx8="http://schemas.microsoft.com/office/drawing/2016/5/14/chartex" xmlns:mc="http://schemas.openxmlformats.org/markup-compatibility/2006" xmlns:aink="http://schemas.microsoft.com/office/drawing/2016/ink" xmlns:am3d="http://schemas.microsoft.com/office/drawing/2017/model3d" xmlns:o="urn:schemas-microsoft-com:office:office" xmlns:r="http://schemas.openxmlformats.org/officeDocument/2006/relationships" xmlns:m="http://schemas.openxmlformats.org/officeDocument/2006/math" xmlns:v="urn:schemas-microsoft-com:vml" xmlns:wp14="http://schemas.microsoft.com/office/word/2010/wordprocessingDrawing" xmlns:wp="http://schemas.openxmlformats.org/drawingml/2006/wordprocessingDrawing" xmlns:w10="urn:schemas-microsoft-com:office:word" xmlns:w="http://schemas.openxmlformats.org/wordprocessingml/2006/main" xmlns:w14="http://schemas.microsoft.com/office/word/2010/wordml" xmlns:w15="http://schemas.microsoft.com/office/word/2012/wordml" xmlns:w16cex="http://schemas.microsoft.com/office/word/2018/wordml/cex" xmlns:w16cid="http://schemas.microsoft.com/office/word/2016/wordml/cid" xmlns:w16="http://schemas.microsoft.com/office/word/2018/wordml" xmlns:w16sdtdh="http://schemas.microsoft.com/office/word/2020/wordml/sdtdatahash" xmlns:w16se="http://schemas.microsoft.com/office/word/2015/wordml/symex" xmlns:wpg="http://schemas.microsoft.com/office/word/2010/wordprocessingGroup" xmlns:wpi="http://schemas.microsoft.com/office/word/2010/wordprocessingInk" xmlns:wne="http://schemas.microsoft.com/office/word/2006/wordml" xmlns:wps="http://schemas.microsoft.com/office/word/2010/wordprocessingShape" mc:Ignorable="w14 w15 w16se w16cid w16 w16cex w16sdtdh wp14">
   <w:body>
     <w:p>
       <w:r>
@@ -8,7 +8,7 @@
           <w:lang w:val="es-ES" w:eastAsia="es-ES"/>
         </w:rPr>
         <w:drawing>
-          <wp:anchor distT="0" distB="0" distL="114300" distR="114300" simplePos="0" relativeHeight="251657216" behindDoc="0" locked="0" layoutInCell="1" allowOverlap="1">
+          <wp:anchor distT="0" distB="0" distL="114300" distR="114300" simplePos="0" relativeHeight="251657216" behindDoc="0" locked="0" layoutInCell="1" allowOverlap="1" wp14:anchorId="086C8BAA" wp14:editId="4736BB85">
             <wp:simplePos x="0" y="0"/>
             <wp:positionH relativeFrom="margin">
               <wp:align>center</wp:align>
@@ -124,7 +124,7 @@
           <w:lang w:val="es-ES" w:eastAsia="es-ES"/>
         </w:rPr>
         <w:drawing>
-          <wp:anchor distT="0" distB="0" distL="114300" distR="114300" simplePos="0" relativeHeight="251658240" behindDoc="0" locked="0" layoutInCell="1" allowOverlap="1">
+          <wp:anchor distT="0" distB="0" distL="114300" distR="114300" simplePos="0" relativeHeight="251658240" behindDoc="0" locked="0" layoutInCell="1" allowOverlap="1" wp14:anchorId="19C4B117" wp14:editId="29CA75AE">
             <wp:simplePos x="0" y="0"/>
             <wp:positionH relativeFrom="margin">
               <wp:align>center</wp:align>
@@ -202,13 +202,13 @@
         <mc:AlternateContent>
           <mc:Choice Requires="wpg">
             <w:drawing>
-              <wp:anchor distT="0" distB="0" distL="457200" distR="457200" simplePos="0" relativeHeight="251663360" behindDoc="0" locked="0" layoutInCell="1" allowOverlap="1">
+              <wp:anchor distT="0" distB="0" distL="457200" distR="457200" simplePos="0" relativeHeight="251663360" behindDoc="0" locked="0" layoutInCell="1" allowOverlap="1" wp14:anchorId="57116223" wp14:editId="531790FA">
                 <wp:simplePos x="0" y="0"/>
                 <wp:positionH relativeFrom="page">
-                  <wp:posOffset>4776470</wp:posOffset>
+                  <wp:posOffset>4775200</wp:posOffset>
                 </wp:positionH>
                 <wp:positionV relativeFrom="margin">
-                  <wp:posOffset>3009265</wp:posOffset>
+                  <wp:posOffset>3009900</wp:posOffset>
                 </wp:positionV>
                 <wp:extent cx="2919730" cy="6617335"/>
                 <wp:effectExtent l="0" t="0" r="0" b="12065"/>
@@ -233,7 +233,7 @@
                         <wps:spPr>
                           <a:xfrm>
                             <a:off x="-725716" y="6993502"/>
-                            <a:ext cx="2057400" cy="1507754"/>
+                            <a:ext cx="2117697" cy="1507754"/>
                           </a:xfrm>
                           <a:prstGeom prst="rect">
                             <a:avLst/>
@@ -340,7 +340,6 @@
                                   <w:placeholder>
                                     <w:docPart w:val="DefaultPlaceholder_-1854013439"/>
                                   </w:placeholder>
-                                  <w:showingPlcHdr/>
                                   <w:dropDownList>
                                     <w:listItem w:value="Elija un elemento."/>
                                     <w:listItem w:displayText="Gener" w:value="Gener"/>
@@ -361,9 +360,13 @@
                                 <w:sdtContent>
                                   <w:r>
                                     <w:rPr>
-                                      <w:rStyle w:val="Textodelmarcadordeposicin"/>
+                                      <w:rFonts w:ascii="Century Gothic" w:eastAsia="Times New Roman" w:hAnsi="Century Gothic" w:cs="Times New Roman"/>
+                                      <w:noProof w:val="0"/>
+                                      <w:sz w:val="20"/>
+                                      <w:szCs w:val="20"/>
+                                      <w:lang w:eastAsia="es-ES"/>
                                     </w:rPr>
-                                    <w:t>Elija un elemento.</w:t>
+                                    <w:t>Setembre</w:t>
                                   </w:r>
                                 </w:sdtContent>
                               </w:sdt>
@@ -404,45 +407,11 @@
                                   <w:szCs w:val="20"/>
                                   <w:lang w:eastAsia="es-ES"/>
                                 </w:rPr>
-                                <w:t xml:space="preserve">: </w:t>
+                                <w:t>:</w:t>
                               </w:r>
-                              <w:sdt>
-                                <w:sdtPr>
-                                  <w:rPr>
-                                    <w:rFonts w:ascii="Century Gothic" w:eastAsia="Times New Roman" w:hAnsi="Century Gothic" w:cs="Times New Roman"/>
-                                    <w:noProof w:val="0"/>
-                                    <w:color w:val="800080"/>
-                                    <w:sz w:val="20"/>
-                                    <w:szCs w:val="20"/>
-                                    <w:lang w:eastAsia="es-ES"/>
-                                  </w:rPr>
-                                  <w:id w:val="2051329214"/>
-                                  <w:placeholder>
-                                    <w:docPart w:val="DefaultPlaceholder_-1854013439"/>
-                                  </w:placeholder>
-                                  <w:showingPlcHdr/>
-                                  <w:dropDownList>
-                                    <w:listItem w:value="Elija un elemento."/>
-                                    <w:listItem w:displayText="2018" w:value="2018"/>
-                                    <w:listItem w:displayText="2019" w:value="2019"/>
-                                    <w:listItem w:displayText="2020" w:value="2020"/>
-                                    <w:listItem w:displayText="2021" w:value="2021"/>
-                                    <w:listItem w:displayText="2022" w:value="2022"/>
-                                    <w:listItem w:displayText="2023" w:value="2023"/>
-                                    <w:listItem w:displayText="2024" w:value="2024"/>
-                                    <w:listItem w:displayText="2025" w:value="2025"/>
-                                  </w:dropDownList>
-                                </w:sdtPr>
-                                <w:sdtEndPr/>
-                                <w:sdtContent>
-                                  <w:r>
-                                    <w:rPr>
-                                      <w:rStyle w:val="Textodelmarcadordeposicin"/>
-                                    </w:rPr>
-                                    <w:t>Elija un elemento.</w:t>
-                                  </w:r>
-                                </w:sdtContent>
-                              </w:sdt>
+                              <w:r>
+                                <w:t xml:space="preserve"> 2026</w:t>
+                              </w:r>
                             </w:p>
                           </w:txbxContent>
                         </wps:txbx>
@@ -707,14 +676,14 @@
               </wp:anchor>
             </w:drawing>
           </mc:Choice>
-          <mc:Fallback xmlns:cx1="http://schemas.microsoft.com/office/drawing/2015/9/8/chartex">
+          <mc:Fallback>
             <w:pict>
-              <v:group id="Grupo 186" o:spid="_x0000_s1026" style="position:absolute;margin-left:376.1pt;margin-top:236.95pt;width:229.9pt;height:521.05pt;z-index:251663360;mso-wrap-distance-left:36pt;mso-wrap-distance-right:36pt;mso-position-horizontal-relative:page;mso-position-vertical-relative:margin;mso-width-relative:margin" coordorigin="-7257,-11972" coordsize="36332,96985" o:gfxdata="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">
+              <v:group w14:anchorId="57116223" id="Grupo 186" o:spid="_x0000_s1026" style="position:absolute;margin-left:376pt;margin-top:237pt;width:229.9pt;height:521.05pt;z-index:251663360;mso-wrap-distance-left:36pt;mso-wrap-distance-right:36pt;mso-position-horizontal-relative:page;mso-position-vertical-relative:margin;mso-width-relative:margin" coordorigin="-7257,-11972" coordsize="36332,96985" o:gfxdata="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">
                 <v:shapetype id="_x0000_t202" coordsize="21600,21600" o:spt="202" path="m,l,21600r21600,l21600,xe">
                   <v:stroke joinstyle="miter"/>
                   <v:path gradientshapeok="t" o:connecttype="rect"/>
                 </v:shapetype>
-                <v:shape id="Cuadro de texto 187" o:spid="_x0000_s1027" type="#_x0000_t202" style="position:absolute;left:-7257;top:69935;width:20573;height:15077;visibility:visible;mso-wrap-style:square;v-text-anchor:top" o:gfxdata="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" filled="f" stroked="f" strokeweight=".5pt">
+                <v:shape id="Cuadro de texto 187" o:spid="_x0000_s1027" type="#_x0000_t202" style="position:absolute;left:-7257;top:69935;width:21176;height:15077;visibility:visible;mso-wrap-style:square;v-text-anchor:top" o:gfxdata="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" filled="f" stroked="f" strokeweight=".5pt">
                   <v:textbox inset="0,0,0,0">
                     <w:txbxContent>
                       <w:p>
@@ -797,7 +766,6 @@
                             <w:placeholder>
                               <w:docPart w:val="DefaultPlaceholder_-1854013439"/>
                             </w:placeholder>
-                            <w:showingPlcHdr/>
                             <w:dropDownList>
                               <w:listItem w:value="Elija un elemento."/>
                               <w:listItem w:displayText="Gener" w:value="Gener"/>
@@ -818,9 +786,13 @@
                           <w:sdtContent>
                             <w:r>
                               <w:rPr>
-                                <w:rStyle w:val="Textodelmarcadordeposicin"/>
+                                <w:rFonts w:ascii="Century Gothic" w:eastAsia="Times New Roman" w:hAnsi="Century Gothic" w:cs="Times New Roman"/>
+                                <w:noProof w:val="0"/>
+                                <w:sz w:val="20"/>
+                                <w:szCs w:val="20"/>
+                                <w:lang w:eastAsia="es-ES"/>
                               </w:rPr>
-                              <w:t>Elija un elemento.</w:t>
+                              <w:t>Setembre</w:t>
                             </w:r>
                           </w:sdtContent>
                         </w:sdt>
@@ -861,45 +833,11 @@
                             <w:szCs w:val="20"/>
                             <w:lang w:eastAsia="es-ES"/>
                           </w:rPr>
-                          <w:t xml:space="preserve">: </w:t>
+                          <w:t>:</w:t>
                         </w:r>
-                        <w:sdt>
-                          <w:sdtPr>
-                            <w:rPr>
-                              <w:rFonts w:ascii="Century Gothic" w:eastAsia="Times New Roman" w:hAnsi="Century Gothic" w:cs="Times New Roman"/>
-                              <w:noProof w:val="0"/>
-                              <w:color w:val="800080"/>
-                              <w:sz w:val="20"/>
-                              <w:szCs w:val="20"/>
-                              <w:lang w:eastAsia="es-ES"/>
-                            </w:rPr>
-                            <w:id w:val="2051329214"/>
-                            <w:placeholder>
-                              <w:docPart w:val="DefaultPlaceholder_-1854013439"/>
-                            </w:placeholder>
-                            <w:showingPlcHdr/>
-                            <w:dropDownList>
-                              <w:listItem w:value="Elija un elemento."/>
-                              <w:listItem w:displayText="2018" w:value="2018"/>
-                              <w:listItem w:displayText="2019" w:value="2019"/>
-                              <w:listItem w:displayText="2020" w:value="2020"/>
-                              <w:listItem w:displayText="2021" w:value="2021"/>
-                              <w:listItem w:displayText="2022" w:value="2022"/>
-                              <w:listItem w:displayText="2023" w:value="2023"/>
-                              <w:listItem w:displayText="2024" w:value="2024"/>
-                              <w:listItem w:displayText="2025" w:value="2025"/>
-                            </w:dropDownList>
-                          </w:sdtPr>
-                          <w:sdtEndPr/>
-                          <w:sdtContent>
-                            <w:r>
-                              <w:rPr>
-                                <w:rStyle w:val="Textodelmarcadordeposicin"/>
-                              </w:rPr>
-                              <w:t>Elija un elemento.</w:t>
-                            </w:r>
-                          </w:sdtContent>
-                        </w:sdt>
+                        <w:r>
+                          <w:t xml:space="preserve"> 2026</w:t>
+                        </w:r>
                       </w:p>
                     </w:txbxContent>
                   </v:textbox>
@@ -933,184 +871,16 @@
         <mc:AlternateContent>
           <mc:Choice Requires="wps">
             <w:drawing>
-              <wp:anchor distT="0" distB="0" distL="114300" distR="114300" simplePos="0" relativeHeight="251664384" behindDoc="0" locked="0" layoutInCell="1" allowOverlap="1">
+              <wp:anchor distT="0" distB="0" distL="114300" distR="114300" simplePos="0" relativeHeight="251661312" behindDoc="0" locked="0" layoutInCell="1" allowOverlap="1" wp14:anchorId="5B1848B7" wp14:editId="6951F6A7">
                 <wp:simplePos x="0" y="0"/>
-                <wp:positionH relativeFrom="page">
-                  <wp:align>right</wp:align>
+                <wp:positionH relativeFrom="margin">
+                  <wp:posOffset>-190500</wp:posOffset>
                 </wp:positionH>
                 <wp:positionV relativeFrom="paragraph">
-                  <wp:posOffset>428132</wp:posOffset>
+                  <wp:posOffset>1447165</wp:posOffset>
                 </wp:positionV>
-                <wp:extent cx="7534251" cy="531495"/>
-                <wp:effectExtent l="0" t="0" r="0" b="1905"/>
-                <wp:wrapNone/>
-                <wp:docPr id="4" name="Rectángulo 4"/>
-                <wp:cNvGraphicFramePr/>
-                <a:graphic xmlns:a="http://schemas.openxmlformats.org/drawingml/2006/main">
-                  <a:graphicData uri="http://schemas.microsoft.com/office/word/2010/wordprocessingShape">
-                    <wps:wsp>
-                      <wps:cNvSpPr/>
-                      <wps:spPr>
-                        <a:xfrm>
-                          <a:off x="0" y="0"/>
-                          <a:ext cx="7534251" cy="531495"/>
-                        </a:xfrm>
-                        <a:prstGeom prst="rect">
-                          <a:avLst/>
-                        </a:prstGeom>
-                        <a:ln>
-                          <a:noFill/>
-                        </a:ln>
-                      </wps:spPr>
-                      <wps:style>
-                        <a:lnRef idx="2">
-                          <a:schemeClr val="accent1">
-                            <a:shade val="50000"/>
-                          </a:schemeClr>
-                        </a:lnRef>
-                        <a:fillRef idx="1">
-                          <a:schemeClr val="accent1"/>
-                        </a:fillRef>
-                        <a:effectRef idx="0">
-                          <a:schemeClr val="accent1"/>
-                        </a:effectRef>
-                        <a:fontRef idx="minor">
-                          <a:schemeClr val="lt1"/>
-                        </a:fontRef>
-                      </wps:style>
-                      <wps:bodyPr rot="0" spcFirstLastPara="0" vertOverflow="overflow" horzOverflow="overflow" vert="horz" wrap="square" lIns="91440" tIns="45720" rIns="91440" bIns="45720" numCol="1" spcCol="0" rtlCol="0" fromWordArt="0" anchor="ctr" anchorCtr="0" forceAA="0" compatLnSpc="1">
-                        <a:prstTxWarp prst="textNoShape">
-                          <a:avLst/>
-                        </a:prstTxWarp>
-                        <a:noAutofit/>
-                      </wps:bodyPr>
-                    </wps:wsp>
-                  </a:graphicData>
-                </a:graphic>
-                <wp14:sizeRelH relativeFrom="margin">
-                  <wp14:pctWidth>0</wp14:pctWidth>
-                </wp14:sizeRelH>
-                <wp14:sizeRelV relativeFrom="margin">
-                  <wp14:pctHeight>0</wp14:pctHeight>
-                </wp14:sizeRelV>
-              </wp:anchor>
-            </w:drawing>
-          </mc:Choice>
-          <mc:Fallback xmlns:cx1="http://schemas.microsoft.com/office/drawing/2015/9/8/chartex">
-            <w:pict>
-              <v:rect w14:anchorId="001628AB" id="Rectángulo 4" o:spid="_x0000_s1026" style="position:absolute;margin-left:542.05pt;margin-top:33.7pt;width:593.25pt;height:41.85pt;z-index:251664384;visibility:visible;mso-wrap-style:square;mso-width-percent:0;mso-height-percent:0;mso-wrap-distance-left:9pt;mso-wrap-distance-top:0;mso-wrap-distance-right:9pt;mso-wrap-distance-bottom:0;mso-position-horizontal:right;mso-position-horizontal-relative:page;mso-position-vertical:absolute;mso-position-vertical-relative:text;mso-width-percent:0;mso-height-percent:0;mso-width-relative:margin;mso-height-relative:margin;v-text-anchor:middle" o:gfxdata="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" fillcolor="#92278f [3204]" stroked="f" strokeweight="1pt">
-                <w10:wrap anchorx="page"/>
-              </v:rect>
-            </w:pict>
-          </mc:Fallback>
-        </mc:AlternateContent>
-      </w:r>
-      <w:r>
-        <w:rPr>
-          <w:lang w:val="es-ES" w:eastAsia="es-ES"/>
-        </w:rPr>
-        <mc:AlternateContent>
-          <mc:Choice Requires="wps">
-            <w:drawing>
-              <wp:anchor distT="0" distB="0" distL="114300" distR="114300" simplePos="0" relativeHeight="251665408" behindDoc="0" locked="0" layoutInCell="1" allowOverlap="1">
-                <wp:simplePos x="0" y="0"/>
-                <wp:positionH relativeFrom="page">
-                  <wp:align>left</wp:align>
-                </wp:positionH>
-                <wp:positionV relativeFrom="paragraph">
-                  <wp:posOffset>428132</wp:posOffset>
-                </wp:positionV>
-                <wp:extent cx="7274172" cy="531495"/>
-                <wp:effectExtent l="0" t="0" r="0" b="1905"/>
-                <wp:wrapNone/>
-                <wp:docPr id="5" name="Triángulo rectángulo 5"/>
-                <wp:cNvGraphicFramePr/>
-                <a:graphic xmlns:a="http://schemas.openxmlformats.org/drawingml/2006/main">
-                  <a:graphicData uri="http://schemas.microsoft.com/office/word/2010/wordprocessingShape">
-                    <wps:wsp>
-                      <wps:cNvSpPr/>
-                      <wps:spPr>
-                        <a:xfrm>
-                          <a:off x="0" y="0"/>
-                          <a:ext cx="7274172" cy="531495"/>
-                        </a:xfrm>
-                        <a:prstGeom prst="rtTriangle">
-                          <a:avLst/>
-                        </a:prstGeom>
-                        <a:solidFill>
-                          <a:schemeClr val="tx2">
-                            <a:lumMod val="60000"/>
-                            <a:lumOff val="40000"/>
-                          </a:schemeClr>
-                        </a:solidFill>
-                        <a:ln>
-                          <a:noFill/>
-                        </a:ln>
-                      </wps:spPr>
-                      <wps:style>
-                        <a:lnRef idx="2">
-                          <a:schemeClr val="accent1">
-                            <a:shade val="50000"/>
-                          </a:schemeClr>
-                        </a:lnRef>
-                        <a:fillRef idx="1">
-                          <a:schemeClr val="accent1"/>
-                        </a:fillRef>
-                        <a:effectRef idx="0">
-                          <a:schemeClr val="accent1"/>
-                        </a:effectRef>
-                        <a:fontRef idx="minor">
-                          <a:schemeClr val="lt1"/>
-                        </a:fontRef>
-                      </wps:style>
-                      <wps:bodyPr rot="0" spcFirstLastPara="0" vertOverflow="overflow" horzOverflow="overflow" vert="horz" wrap="square" lIns="91440" tIns="45720" rIns="91440" bIns="45720" numCol="1" spcCol="0" rtlCol="0" fromWordArt="0" anchor="ctr" anchorCtr="0" forceAA="0" compatLnSpc="1">
-                        <a:prstTxWarp prst="textNoShape">
-                          <a:avLst/>
-                        </a:prstTxWarp>
-                        <a:noAutofit/>
-                      </wps:bodyPr>
-                    </wps:wsp>
-                  </a:graphicData>
-                </a:graphic>
-                <wp14:sizeRelH relativeFrom="margin">
-                  <wp14:pctWidth>0</wp14:pctWidth>
-                </wp14:sizeRelH>
-                <wp14:sizeRelV relativeFrom="margin">
-                  <wp14:pctHeight>0</wp14:pctHeight>
-                </wp14:sizeRelV>
-              </wp:anchor>
-            </w:drawing>
-          </mc:Choice>
-          <mc:Fallback xmlns:cx1="http://schemas.microsoft.com/office/drawing/2015/9/8/chartex">
-            <w:pict>
-              <v:shapetype w14:anchorId="7555C226" id="_x0000_t6" coordsize="21600,21600" o:spt="6" path="m,l,21600r21600,xe">
-                <v:stroke joinstyle="miter"/>
-                <v:path gradientshapeok="t" o:connecttype="custom" o:connectlocs="0,0;0,10800;0,21600;10800,21600;21600,21600;10800,10800" textboxrect="1800,12600,12600,19800"/>
-              </v:shapetype>
-              <v:shape id="Triángulo rectángulo 5" o:spid="_x0000_s1026" type="#_x0000_t6" style="position:absolute;margin-left:0;margin-top:33.7pt;width:572.75pt;height:41.85pt;z-index:251665408;visibility:visible;mso-wrap-style:square;mso-width-percent:0;mso-height-percent:0;mso-wrap-distance-left:9pt;mso-wrap-distance-top:0;mso-wrap-distance-right:9pt;mso-wrap-distance-bottom:0;mso-position-horizontal:left;mso-position-horizontal-relative:page;mso-position-vertical:absolute;mso-position-vertical-relative:text;mso-width-percent:0;mso-height-percent:0;mso-width-relative:margin;mso-height-relative:margin;v-text-anchor:middle" o:gfxdata="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" fillcolor="#b969b8 [1951]" stroked="f" strokeweight="1pt">
-                <w10:wrap anchorx="page"/>
-              </v:shape>
-            </w:pict>
-          </mc:Fallback>
-        </mc:AlternateContent>
-      </w:r>
-      <w:r>
-        <w:rPr>
-          <w:lang w:val="es-ES" w:eastAsia="es-ES"/>
-        </w:rPr>
-        <mc:AlternateContent>
-          <mc:Choice Requires="wps">
-            <w:drawing>
-              <wp:anchor distT="0" distB="0" distL="114300" distR="114300" simplePos="0" relativeHeight="251661312" behindDoc="0" locked="0" layoutInCell="1" allowOverlap="1">
-                <wp:simplePos x="0" y="0"/>
-                <wp:positionH relativeFrom="margin">
-                  <wp:posOffset>-48260</wp:posOffset>
-                </wp:positionH>
-                <wp:positionV relativeFrom="paragraph">
-                  <wp:posOffset>1478915</wp:posOffset>
-                </wp:positionV>
-                <wp:extent cx="6223000" cy="3984625"/>
-                <wp:effectExtent l="0" t="0" r="6350" b="0"/>
+                <wp:extent cx="6407150" cy="3984625"/>
+                <wp:effectExtent l="0" t="0" r="12700" b="0"/>
                 <wp:wrapSquare wrapText="bothSides"/>
                 <wp:docPr id="85" name="Cuadro de texto 85"/>
                 <wp:cNvGraphicFramePr/>
@@ -1121,7 +891,7 @@
                       <wps:spPr>
                         <a:xfrm>
                           <a:off x="0" y="0"/>
-                          <a:ext cx="6223000" cy="3984625"/>
+                          <a:ext cx="6407150" cy="3984625"/>
                         </a:xfrm>
                         <a:prstGeom prst="rect">
                           <a:avLst/>
@@ -1172,40 +942,10 @@
                             </w:r>
                             <w:r>
                               <w:rPr>
-                                <w:rFonts w:ascii="Century Gothic" w:hAnsi="Century Gothic"/>
-                                <w:b/>
-                                <w:lang w:val="ca-ES"/>
+                                <w:rStyle w:val="Textoennegrita"/>
                               </w:rPr>
-                              <w:t xml:space="preserve"> </w:t>
+                              <w:t xml:space="preserve"> Xiao Long Ji</w:t>
                             </w:r>
-                            <w:r>
-                              <w:rPr>
-                                <w:rFonts w:ascii="Century Gothic" w:hAnsi="Century Gothic"/>
-                                <w:b/>
-                                <w:lang w:val="ca-ES"/>
-                              </w:rPr>
-                              <w:t xml:space="preserve"> </w:t>
-                            </w:r>
-                            <w:sdt>
-                              <w:sdtPr>
-                                <w:rPr>
-                                  <w:rFonts w:ascii="Century Gothic" w:hAnsi="Century Gothic"/>
-                                  <w:b/>
-                                  <w:lang w:val="ca-ES"/>
-                                </w:rPr>
-                                <w:id w:val="1339506104"/>
-                                <w:showingPlcHdr/>
-                              </w:sdtPr>
-                              <w:sdtEndPr/>
-                              <w:sdtContent>
-                                <w:r>
-                                  <w:rPr>
-                                    <w:rStyle w:val="Textodelmarcadordeposicin"/>
-                                  </w:rPr>
-                                  <w:t>Haga clic o pulse aquí para escribir texto.</w:t>
-                                </w:r>
-                              </w:sdtContent>
-                            </w:sdt>
                           </w:p>
                           <w:p>
                             <w:pPr>
@@ -1286,7 +1026,7 @@
                                     <w:color w:val="000000" w:themeColor="text1"/>
                                     <w:lang w:val="ca-ES"/>
                                   </w:rPr>
-                                  <w:t>Elija un elemento</w:t>
+                                  <w:t>Grau en Enginyeria Informàtica</w:t>
                                 </w:r>
                               </w:sdtContent>
                             </w:sdt>
@@ -1331,52 +1071,65 @@
                             <w:r>
                               <w:rPr>
                                 <w:rStyle w:val="Textoennegrita"/>
-                                <w:rFonts w:ascii="Century Gothic" w:hAnsi="Century Gothic"/>
-                                <w:b w:val="0"/>
-                                <w:color w:val="800080"/>
-                                <w:lang w:val="ca-ES"/>
+                              </w:rPr>
+                              <w:t xml:space="preserve"> Comparativa de </w:t>
+                            </w:r>
+                            <w:proofErr w:type="spellStart"/>
+                            <w:r>
+                              <w:rPr>
+                                <w:rStyle w:val="Textoennegrita"/>
+                              </w:rPr>
+                              <w:t>Systemd</w:t>
+                            </w:r>
+                            <w:proofErr w:type="spellEnd"/>
+                            <w:r>
+                              <w:rPr>
+                                <w:rStyle w:val="Textoennegrita"/>
                               </w:rPr>
                               <w:t xml:space="preserve"> </w:t>
                             </w:r>
-                            <w:sdt>
-                              <w:sdtPr>
-                                <w:rPr>
-                                  <w:rStyle w:val="Textoennegrita"/>
-                                  <w:rFonts w:ascii="Century Gothic" w:hAnsi="Century Gothic"/>
-                                  <w:b w:val="0"/>
-                                  <w:color w:val="800080"/>
-                                  <w:lang w:val="ca-ES"/>
-                                </w:rPr>
-                                <w:id w:val="547891688"/>
-                                <w:showingPlcHdr/>
-                              </w:sdtPr>
-                              <w:sdtEndPr>
-                                <w:rPr>
-                                  <w:rStyle w:val="Textoennegrita"/>
-                                </w:rPr>
-                              </w:sdtEndPr>
-                              <w:sdtContent>
-                                <w:r>
-                                  <w:rPr>
-                                    <w:rStyle w:val="Textodelmarcadordeposicin"/>
-                                    <w:color w:val="000000" w:themeColor="text1"/>
-                                  </w:rPr>
-                                  <w:t>Haga clic o pulse aquí para escribir texto.</w:t>
-                                </w:r>
-                              </w:sdtContent>
-                            </w:sdt>
-                          </w:p>
-                          <w:p>
-                            <w:pPr>
-                              <w:pStyle w:val="NormalWeb"/>
+                            <w:proofErr w:type="spellStart"/>
+                            <w:r>
                               <w:rPr>
                                 <w:rStyle w:val="Textoennegrita"/>
-                                <w:rFonts w:ascii="Century Gothic" w:hAnsi="Century Gothic"/>
-                                <w:b w:val="0"/>
-                                <w:color w:val="800080"/>
-                                <w:lang w:val="ca-ES"/>
                               </w:rPr>
-                            </w:pPr>
+                              <w:t>amb</w:t>
+                            </w:r>
+                            <w:proofErr w:type="spellEnd"/>
+                            <w:r>
+                              <w:rPr>
+                                <w:rStyle w:val="Textoennegrita"/>
+                              </w:rPr>
+                              <w:t xml:space="preserve"> </w:t>
+                            </w:r>
+                            <w:proofErr w:type="spellStart"/>
+                            <w:r>
+                              <w:rPr>
+                                <w:rStyle w:val="Textoennegrita"/>
+                              </w:rPr>
+                              <w:t>Kubernetes</w:t>
+                            </w:r>
+                            <w:proofErr w:type="spellEnd"/>
+                            <w:r>
+                              <w:rPr>
+                                <w:rStyle w:val="Textoennegrita"/>
+                              </w:rPr>
+                              <w:t xml:space="preserve"> a </w:t>
+                            </w:r>
+                            <w:proofErr w:type="spellStart"/>
+                            <w:r>
+                              <w:rPr>
+                                <w:rStyle w:val="Textoennegrita"/>
+                              </w:rPr>
+                              <w:t>l'enton</w:t>
+                            </w:r>
+                            <w:proofErr w:type="spellEnd"/>
+                            <w:r>
+                              <w:rPr>
+                                <w:rStyle w:val="Textoennegrita"/>
+                              </w:rPr>
+                              <w:t xml:space="preserve"> Edge</w:t>
+                            </w:r>
                           </w:p>
                           <w:p>
                             <w:pPr>
@@ -1470,33 +1223,26 @@
                               </w:rPr>
                               <w:t xml:space="preserve"> </w:t>
                             </w:r>
-                            <w:sdt>
-                              <w:sdtPr>
-                                <w:rPr>
-                                  <w:rStyle w:val="Textoennegrita"/>
-                                  <w:rFonts w:ascii="Century Gothic" w:hAnsi="Century Gothic"/>
-                                  <w:b w:val="0"/>
-                                  <w:color w:val="800080"/>
-                                  <w:lang w:val="ca-ES"/>
-                                </w:rPr>
-                                <w:id w:val="-428195031"/>
-                                <w:showingPlcHdr/>
-                              </w:sdtPr>
-                              <w:sdtEndPr>
-                                <w:rPr>
-                                  <w:rStyle w:val="Textoennegrita"/>
-                                </w:rPr>
-                              </w:sdtEndPr>
-                              <w:sdtContent>
-                                <w:r>
-                                  <w:rPr>
-                                    <w:rStyle w:val="Textodelmarcadordeposicin"/>
-                                    <w:color w:val="000000" w:themeColor="text1"/>
-                                  </w:rPr>
-                                  <w:t>Haga clic o pulse aquí para escribir texto.</w:t>
-                                </w:r>
-                              </w:sdtContent>
-                            </w:sdt>
+                            <w:r>
+                              <w:rPr>
+                                <w:rStyle w:val="Textoennegrita"/>
+                              </w:rPr>
+                              <w:t xml:space="preserve">Oriol </w:t>
+                            </w:r>
+                            <w:proofErr w:type="spellStart"/>
+                            <w:r>
+                              <w:rPr>
+                                <w:rStyle w:val="Textoennegrita"/>
+                              </w:rPr>
+                              <w:t>Agost</w:t>
+                            </w:r>
+                            <w:proofErr w:type="spellEnd"/>
+                            <w:r>
+                              <w:rPr>
+                                <w:rStyle w:val="Textoennegrita"/>
+                              </w:rPr>
+                              <w:t xml:space="preserve"> Batalla, Jordi Mateo Fornés  </w:t>
+                            </w:r>
                           </w:p>
                           <w:p>
                             <w:pPr>
@@ -1530,11 +1276,7 @@
           </mc:Choice>
           <mc:Fallback>
             <w:pict>
-              <v:shapetype id="_x0000_t202" coordsize="21600,21600" o:spt="202" path="m,l,21600r21600,l21600,xe">
-                <v:stroke joinstyle="miter"/>
-                <v:path gradientshapeok="t" o:connecttype="rect"/>
-              </v:shapetype>
-              <v:shape id="Cuadro de texto 85" o:spid="_x0000_s1033" type="#_x0000_t202" style="position:absolute;margin-left:-3.8pt;margin-top:116.45pt;width:490pt;height:313.75pt;z-index:251661312;visibility:visible;mso-wrap-style:square;mso-width-percent:0;mso-height-percent:0;mso-wrap-distance-left:9pt;mso-wrap-distance-top:0;mso-wrap-distance-right:9pt;mso-wrap-distance-bottom:0;mso-position-horizontal:absolute;mso-position-horizontal-relative:margin;mso-position-vertical:absolute;mso-position-vertical-relative:text;mso-width-percent:0;mso-height-percent:0;mso-width-relative:margin;mso-height-relative:margin;v-text-anchor:top" o:gfxdata="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" filled="f" stroked="f" strokeweight=".5pt">
+              <v:shape w14:anchorId="5B1848B7" id="Cuadro de texto 85" o:spid="_x0000_s1033" type="#_x0000_t202" style="position:absolute;margin-left:-15pt;margin-top:113.95pt;width:504.5pt;height:313.75pt;z-index:251661312;visibility:visible;mso-wrap-style:square;mso-width-percent:0;mso-height-percent:0;mso-wrap-distance-left:9pt;mso-wrap-distance-top:0;mso-wrap-distance-right:9pt;mso-wrap-distance-bottom:0;mso-position-horizontal:absolute;mso-position-horizontal-relative:margin;mso-position-vertical:absolute;mso-position-vertical-relative:text;mso-width-percent:0;mso-height-percent:0;mso-width-relative:margin;mso-height-relative:margin;v-text-anchor:top" o:gfxdata="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" filled="f" stroked="f" strokeweight=".5pt">
                 <v:textbox inset="0,0,0,0">
                   <w:txbxContent>
                     <w:p>
@@ -1561,40 +1303,10 @@
                       </w:r>
                       <w:r>
                         <w:rPr>
-                          <w:rFonts w:ascii="Century Gothic" w:hAnsi="Century Gothic"/>
-                          <w:b/>
-                          <w:lang w:val="ca-ES"/>
+                          <w:rStyle w:val="Textoennegrita"/>
                         </w:rPr>
-                        <w:t xml:space="preserve"> </w:t>
+                        <w:t xml:space="preserve"> Xiao Long Ji</w:t>
                       </w:r>
-                      <w:r>
-                        <w:rPr>
-                          <w:rFonts w:ascii="Century Gothic" w:hAnsi="Century Gothic"/>
-                          <w:b/>
-                          <w:lang w:val="ca-ES"/>
-                        </w:rPr>
-                        <w:t xml:space="preserve"> </w:t>
-                      </w:r>
-                      <w:sdt>
-                        <w:sdtPr>
-                          <w:rPr>
-                            <w:rFonts w:ascii="Century Gothic" w:hAnsi="Century Gothic"/>
-                            <w:b/>
-                            <w:lang w:val="ca-ES"/>
-                          </w:rPr>
-                          <w:id w:val="1339506104"/>
-                          <w:showingPlcHdr/>
-                        </w:sdtPr>
-                        <w:sdtEndPr/>
-                        <w:sdtContent>
-                          <w:r>
-                            <w:rPr>
-                              <w:rStyle w:val="Textodelmarcadordeposicin"/>
-                            </w:rPr>
-                            <w:t>Haga clic o pulse aquí para escribir texto.</w:t>
-                          </w:r>
-                        </w:sdtContent>
-                      </w:sdt>
                     </w:p>
                     <w:p>
                       <w:pPr>
@@ -1675,7 +1387,7 @@
                               <w:color w:val="000000" w:themeColor="text1"/>
                               <w:lang w:val="ca-ES"/>
                             </w:rPr>
-                            <w:t>Elija un elemento</w:t>
+                            <w:t>Grau en Enginyeria Informàtica</w:t>
                           </w:r>
                         </w:sdtContent>
                       </w:sdt>
@@ -1720,52 +1432,65 @@
                       <w:r>
                         <w:rPr>
                           <w:rStyle w:val="Textoennegrita"/>
-                          <w:rFonts w:ascii="Century Gothic" w:hAnsi="Century Gothic"/>
-                          <w:b w:val="0"/>
-                          <w:color w:val="800080"/>
-                          <w:lang w:val="ca-ES"/>
+                        </w:rPr>
+                        <w:t xml:space="preserve"> Comparativa de </w:t>
+                      </w:r>
+                      <w:proofErr w:type="spellStart"/>
+                      <w:r>
+                        <w:rPr>
+                          <w:rStyle w:val="Textoennegrita"/>
+                        </w:rPr>
+                        <w:t>Systemd</w:t>
+                      </w:r>
+                      <w:proofErr w:type="spellEnd"/>
+                      <w:r>
+                        <w:rPr>
+                          <w:rStyle w:val="Textoennegrita"/>
                         </w:rPr>
                         <w:t xml:space="preserve"> </w:t>
                       </w:r>
-                      <w:sdt>
-                        <w:sdtPr>
-                          <w:rPr>
-                            <w:rStyle w:val="Textoennegrita"/>
-                            <w:rFonts w:ascii="Century Gothic" w:hAnsi="Century Gothic"/>
-                            <w:b w:val="0"/>
-                            <w:color w:val="800080"/>
-                            <w:lang w:val="ca-ES"/>
-                          </w:rPr>
-                          <w:id w:val="547891688"/>
-                          <w:showingPlcHdr/>
-                        </w:sdtPr>
-                        <w:sdtEndPr>
-                          <w:rPr>
-                            <w:rStyle w:val="Textoennegrita"/>
-                          </w:rPr>
-                        </w:sdtEndPr>
-                        <w:sdtContent>
-                          <w:r>
-                            <w:rPr>
-                              <w:rStyle w:val="Textodelmarcadordeposicin"/>
-                              <w:color w:val="000000" w:themeColor="text1"/>
-                            </w:rPr>
-                            <w:t>Haga clic o pulse aquí para escribir texto.</w:t>
-                          </w:r>
-                        </w:sdtContent>
-                      </w:sdt>
-                    </w:p>
-                    <w:p>
-                      <w:pPr>
-                        <w:pStyle w:val="NormalWeb"/>
+                      <w:proofErr w:type="spellStart"/>
+                      <w:r>
                         <w:rPr>
                           <w:rStyle w:val="Textoennegrita"/>
-                          <w:rFonts w:ascii="Century Gothic" w:hAnsi="Century Gothic"/>
-                          <w:b w:val="0"/>
-                          <w:color w:val="800080"/>
-                          <w:lang w:val="ca-ES"/>
                         </w:rPr>
-                      </w:pPr>
+                        <w:t>amb</w:t>
+                      </w:r>
+                      <w:proofErr w:type="spellEnd"/>
+                      <w:r>
+                        <w:rPr>
+                          <w:rStyle w:val="Textoennegrita"/>
+                        </w:rPr>
+                        <w:t xml:space="preserve"> </w:t>
+                      </w:r>
+                      <w:proofErr w:type="spellStart"/>
+                      <w:r>
+                        <w:rPr>
+                          <w:rStyle w:val="Textoennegrita"/>
+                        </w:rPr>
+                        <w:t>Kubernetes</w:t>
+                      </w:r>
+                      <w:proofErr w:type="spellEnd"/>
+                      <w:r>
+                        <w:rPr>
+                          <w:rStyle w:val="Textoennegrita"/>
+                        </w:rPr>
+                        <w:t xml:space="preserve"> a </w:t>
+                      </w:r>
+                      <w:proofErr w:type="spellStart"/>
+                      <w:r>
+                        <w:rPr>
+                          <w:rStyle w:val="Textoennegrita"/>
+                        </w:rPr>
+                        <w:t>l'enton</w:t>
+                      </w:r>
+                      <w:proofErr w:type="spellEnd"/>
+                      <w:r>
+                        <w:rPr>
+                          <w:rStyle w:val="Textoennegrita"/>
+                        </w:rPr>
+                        <w:t xml:space="preserve"> Edge</w:t>
+                      </w:r>
                     </w:p>
                     <w:p>
                       <w:pPr>
@@ -1859,33 +1584,26 @@
                         </w:rPr>
                         <w:t xml:space="preserve"> </w:t>
                       </w:r>
-                      <w:sdt>
-                        <w:sdtPr>
-                          <w:rPr>
-                            <w:rStyle w:val="Textoennegrita"/>
-                            <w:rFonts w:ascii="Century Gothic" w:hAnsi="Century Gothic"/>
-                            <w:b w:val="0"/>
-                            <w:color w:val="800080"/>
-                            <w:lang w:val="ca-ES"/>
-                          </w:rPr>
-                          <w:id w:val="-428195031"/>
-                          <w:showingPlcHdr/>
-                        </w:sdtPr>
-                        <w:sdtEndPr>
-                          <w:rPr>
-                            <w:rStyle w:val="Textoennegrita"/>
-                          </w:rPr>
-                        </w:sdtEndPr>
-                        <w:sdtContent>
-                          <w:r>
-                            <w:rPr>
-                              <w:rStyle w:val="Textodelmarcadordeposicin"/>
-                              <w:color w:val="000000" w:themeColor="text1"/>
-                            </w:rPr>
-                            <w:t>Haga clic o pulse aquí para escribir texto.</w:t>
-                          </w:r>
-                        </w:sdtContent>
-                      </w:sdt>
+                      <w:r>
+                        <w:rPr>
+                          <w:rStyle w:val="Textoennegrita"/>
+                        </w:rPr>
+                        <w:t xml:space="preserve">Oriol </w:t>
+                      </w:r>
+                      <w:proofErr w:type="spellStart"/>
+                      <w:r>
+                        <w:rPr>
+                          <w:rStyle w:val="Textoennegrita"/>
+                        </w:rPr>
+                        <w:t>Agost</w:t>
+                      </w:r>
+                      <w:proofErr w:type="spellEnd"/>
+                      <w:r>
+                        <w:rPr>
+                          <w:rStyle w:val="Textoennegrita"/>
+                        </w:rPr>
+                        <w:t xml:space="preserve"> Batalla, Jordi Mateo Fornés  </w:t>
+                      </w:r>
                     </w:p>
                     <w:p>
                       <w:pPr>
@@ -1900,6 +1618,174 @@
                   </w:txbxContent>
                 </v:textbox>
                 <w10:wrap type="square" anchorx="margin"/>
+              </v:shape>
+            </w:pict>
+          </mc:Fallback>
+        </mc:AlternateContent>
+      </w:r>
+      <w:r>
+        <w:rPr>
+          <w:lang w:val="es-ES" w:eastAsia="es-ES"/>
+        </w:rPr>
+        <mc:AlternateContent>
+          <mc:Choice Requires="wps">
+            <w:drawing>
+              <wp:anchor distT="0" distB="0" distL="114300" distR="114300" simplePos="0" relativeHeight="251664384" behindDoc="0" locked="0" layoutInCell="1" allowOverlap="1" wp14:anchorId="6FBAC976" wp14:editId="6BCFB99D">
+                <wp:simplePos x="0" y="0"/>
+                <wp:positionH relativeFrom="page">
+                  <wp:align>right</wp:align>
+                </wp:positionH>
+                <wp:positionV relativeFrom="paragraph">
+                  <wp:posOffset>428132</wp:posOffset>
+                </wp:positionV>
+                <wp:extent cx="7534251" cy="531495"/>
+                <wp:effectExtent l="0" t="0" r="0" b="1905"/>
+                <wp:wrapNone/>
+                <wp:docPr id="4" name="Rectángulo 4"/>
+                <wp:cNvGraphicFramePr/>
+                <a:graphic xmlns:a="http://schemas.openxmlformats.org/drawingml/2006/main">
+                  <a:graphicData uri="http://schemas.microsoft.com/office/word/2010/wordprocessingShape">
+                    <wps:wsp>
+                      <wps:cNvSpPr/>
+                      <wps:spPr>
+                        <a:xfrm>
+                          <a:off x="0" y="0"/>
+                          <a:ext cx="7534251" cy="531495"/>
+                        </a:xfrm>
+                        <a:prstGeom prst="rect">
+                          <a:avLst/>
+                        </a:prstGeom>
+                        <a:ln>
+                          <a:noFill/>
+                        </a:ln>
+                      </wps:spPr>
+                      <wps:style>
+                        <a:lnRef idx="2">
+                          <a:schemeClr val="accent1">
+                            <a:shade val="50000"/>
+                          </a:schemeClr>
+                        </a:lnRef>
+                        <a:fillRef idx="1">
+                          <a:schemeClr val="accent1"/>
+                        </a:fillRef>
+                        <a:effectRef idx="0">
+                          <a:schemeClr val="accent1"/>
+                        </a:effectRef>
+                        <a:fontRef idx="minor">
+                          <a:schemeClr val="lt1"/>
+                        </a:fontRef>
+                      </wps:style>
+                      <wps:bodyPr rot="0" spcFirstLastPara="0" vertOverflow="overflow" horzOverflow="overflow" vert="horz" wrap="square" lIns="91440" tIns="45720" rIns="91440" bIns="45720" numCol="1" spcCol="0" rtlCol="0" fromWordArt="0" anchor="ctr" anchorCtr="0" forceAA="0" compatLnSpc="1">
+                        <a:prstTxWarp prst="textNoShape">
+                          <a:avLst/>
+                        </a:prstTxWarp>
+                        <a:noAutofit/>
+                      </wps:bodyPr>
+                    </wps:wsp>
+                  </a:graphicData>
+                </a:graphic>
+                <wp14:sizeRelH relativeFrom="margin">
+                  <wp14:pctWidth>0</wp14:pctWidth>
+                </wp14:sizeRelH>
+                <wp14:sizeRelV relativeFrom="margin">
+                  <wp14:pctHeight>0</wp14:pctHeight>
+                </wp14:sizeRelV>
+              </wp:anchor>
+            </w:drawing>
+          </mc:Choice>
+          <mc:Fallback>
+            <w:pict>
+              <v:rect w14:anchorId="001628AB" id="Rectángulo 4" o:spid="_x0000_s1026" style="position:absolute;margin-left:542.05pt;margin-top:33.7pt;width:593.25pt;height:41.85pt;z-index:251664384;visibility:visible;mso-wrap-style:square;mso-width-percent:0;mso-height-percent:0;mso-wrap-distance-left:9pt;mso-wrap-distance-top:0;mso-wrap-distance-right:9pt;mso-wrap-distance-bottom:0;mso-position-horizontal:right;mso-position-horizontal-relative:page;mso-position-vertical:absolute;mso-position-vertical-relative:text;mso-width-percent:0;mso-height-percent:0;mso-width-relative:margin;mso-height-relative:margin;v-text-anchor:middle" o:gfxdata="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" fillcolor="#92278f [3204]" stroked="f" strokeweight="1pt">
+                <w10:wrap anchorx="page"/>
+              </v:rect>
+            </w:pict>
+          </mc:Fallback>
+        </mc:AlternateContent>
+      </w:r>
+      <w:r>
+        <w:rPr>
+          <w:lang w:val="es-ES" w:eastAsia="es-ES"/>
+        </w:rPr>
+        <mc:AlternateContent>
+          <mc:Choice Requires="wps">
+            <w:drawing>
+              <wp:anchor distT="0" distB="0" distL="114300" distR="114300" simplePos="0" relativeHeight="251665408" behindDoc="0" locked="0" layoutInCell="1" allowOverlap="1" wp14:anchorId="1B109EB8" wp14:editId="461EAC30">
+                <wp:simplePos x="0" y="0"/>
+                <wp:positionH relativeFrom="page">
+                  <wp:align>left</wp:align>
+                </wp:positionH>
+                <wp:positionV relativeFrom="paragraph">
+                  <wp:posOffset>428132</wp:posOffset>
+                </wp:positionV>
+                <wp:extent cx="7274172" cy="531495"/>
+                <wp:effectExtent l="0" t="0" r="0" b="1905"/>
+                <wp:wrapNone/>
+                <wp:docPr id="5" name="Triángulo rectángulo 5"/>
+                <wp:cNvGraphicFramePr/>
+                <a:graphic xmlns:a="http://schemas.openxmlformats.org/drawingml/2006/main">
+                  <a:graphicData uri="http://schemas.microsoft.com/office/word/2010/wordprocessingShape">
+                    <wps:wsp>
+                      <wps:cNvSpPr/>
+                      <wps:spPr>
+                        <a:xfrm>
+                          <a:off x="0" y="0"/>
+                          <a:ext cx="7274172" cy="531495"/>
+                        </a:xfrm>
+                        <a:prstGeom prst="rtTriangle">
+                          <a:avLst/>
+                        </a:prstGeom>
+                        <a:solidFill>
+                          <a:schemeClr val="tx2">
+                            <a:lumMod val="60000"/>
+                            <a:lumOff val="40000"/>
+                          </a:schemeClr>
+                        </a:solidFill>
+                        <a:ln>
+                          <a:noFill/>
+                        </a:ln>
+                      </wps:spPr>
+                      <wps:style>
+                        <a:lnRef idx="2">
+                          <a:schemeClr val="accent1">
+                            <a:shade val="50000"/>
+                          </a:schemeClr>
+                        </a:lnRef>
+                        <a:fillRef idx="1">
+                          <a:schemeClr val="accent1"/>
+                        </a:fillRef>
+                        <a:effectRef idx="0">
+                          <a:schemeClr val="accent1"/>
+                        </a:effectRef>
+                        <a:fontRef idx="minor">
+                          <a:schemeClr val="lt1"/>
+                        </a:fontRef>
+                      </wps:style>
+                      <wps:bodyPr rot="0" spcFirstLastPara="0" vertOverflow="overflow" horzOverflow="overflow" vert="horz" wrap="square" lIns="91440" tIns="45720" rIns="91440" bIns="45720" numCol="1" spcCol="0" rtlCol="0" fromWordArt="0" anchor="ctr" anchorCtr="0" forceAA="0" compatLnSpc="1">
+                        <a:prstTxWarp prst="textNoShape">
+                          <a:avLst/>
+                        </a:prstTxWarp>
+                        <a:noAutofit/>
+                      </wps:bodyPr>
+                    </wps:wsp>
+                  </a:graphicData>
+                </a:graphic>
+                <wp14:sizeRelH relativeFrom="margin">
+                  <wp14:pctWidth>0</wp14:pctWidth>
+                </wp14:sizeRelH>
+                <wp14:sizeRelV relativeFrom="margin">
+                  <wp14:pctHeight>0</wp14:pctHeight>
+                </wp14:sizeRelV>
+              </wp:anchor>
+            </w:drawing>
+          </mc:Choice>
+          <mc:Fallback>
+            <w:pict>
+              <v:shapetype w14:anchorId="2F73A47B" id="_x0000_t6" coordsize="21600,21600" o:spt="6" path="m,l,21600r21600,xe">
+                <v:stroke joinstyle="miter"/>
+                <v:path gradientshapeok="t" o:connecttype="custom" o:connectlocs="0,0;0,10800;0,21600;10800,21600;21600,21600;10800,10800" textboxrect="1800,12600,12600,19800"/>
+              </v:shapetype>
+              <v:shape id="Triángulo rectángulo 5" o:spid="_x0000_s1026" type="#_x0000_t6" style="position:absolute;margin-left:0;margin-top:33.7pt;width:572.75pt;height:41.85pt;z-index:251665408;visibility:visible;mso-wrap-style:square;mso-width-percent:0;mso-height-percent:0;mso-wrap-distance-left:9pt;mso-wrap-distance-top:0;mso-wrap-distance-right:9pt;mso-wrap-distance-bottom:0;mso-position-horizontal:left;mso-position-horizontal-relative:page;mso-position-vertical:absolute;mso-position-vertical-relative:text;mso-width-percent:0;mso-height-percent:0;mso-width-relative:margin;mso-height-relative:margin;v-text-anchor:middle" o:gfxdata="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" fillcolor="#b969b8 [1951]" stroked="f" strokeweight="1pt">
+                <w10:wrap anchorx="page"/>
               </v:shape>
             </w:pict>
           </mc:Fallback>
@@ -1923,7 +1809,7 @@
 </file>
 
 <file path=word/numbering.xml><?xml version="1.0" encoding="utf-8"?>
-<w:numbering xmlns:wpc="http://schemas.microsoft.com/office/word/2010/wordprocessingCanvas" xmlns:cx="http://schemas.microsoft.com/office/drawing/2014/chartex" xmlns:mc="http://schemas.openxmlformats.org/markup-compatibility/2006" xmlns:o="urn:schemas-microsoft-com:office:office" xmlns:r="http://schemas.openxmlformats.org/officeDocument/2006/relationships" xmlns:m="http://schemas.openxmlformats.org/officeDocument/2006/math" xmlns:v="urn:schemas-microsoft-com:vml" xmlns:wp14="http://schemas.microsoft.com/office/word/2010/wordprocessingDrawing" xmlns:wp="http://schemas.openxmlformats.org/drawingml/2006/wordprocessingDrawing" xmlns:w10="urn:schemas-microsoft-com:office:word" xmlns:w="http://schemas.openxmlformats.org/wordprocessingml/2006/main" xmlns:w14="http://schemas.microsoft.com/office/word/2010/wordml" xmlns:w15="http://schemas.microsoft.com/office/word/2012/wordml" xmlns:w16se="http://schemas.microsoft.com/office/word/2015/wordml/symex" xmlns:wpg="http://schemas.microsoft.com/office/word/2010/wordprocessingGroup" xmlns:wpi="http://schemas.microsoft.com/office/word/2010/wordprocessingInk" xmlns:wne="http://schemas.microsoft.com/office/word/2006/wordml" xmlns:wps="http://schemas.microsoft.com/office/word/2010/wordprocessingShape" mc:Ignorable="w14 w15 w16se wp14">
+<w:numbering xmlns:wpc="http://schemas.microsoft.com/office/word/2010/wordprocessingCanvas" xmlns:cx="http://schemas.microsoft.com/office/drawing/2014/chartex" xmlns:cx1="http://schemas.microsoft.com/office/drawing/2015/9/8/chartex" xmlns:cx2="http://schemas.microsoft.com/office/drawing/2015/10/21/chartex" xmlns:cx3="http://schemas.microsoft.com/office/drawing/2016/5/9/chartex" xmlns:cx4="http://schemas.microsoft.com/office/drawing/2016/5/10/chartex" xmlns:cx5="http://schemas.microsoft.com/office/drawing/2016/5/11/chartex" xmlns:cx6="http://schemas.microsoft.com/office/drawing/2016/5/12/chartex" xmlns:cx7="http://schemas.microsoft.com/office/drawing/2016/5/13/chartex" xmlns:cx8="http://schemas.microsoft.com/office/drawing/2016/5/14/chartex" xmlns:mc="http://schemas.openxmlformats.org/markup-compatibility/2006" xmlns:aink="http://schemas.microsoft.com/office/drawing/2016/ink" xmlns:am3d="http://schemas.microsoft.com/office/drawing/2017/model3d" xmlns:o="urn:schemas-microsoft-com:office:office" xmlns:r="http://schemas.openxmlformats.org/officeDocument/2006/relationships" xmlns:m="http://schemas.openxmlformats.org/officeDocument/2006/math" xmlns:v="urn:schemas-microsoft-com:vml" xmlns:wp14="http://schemas.microsoft.com/office/word/2010/wordprocessingDrawing" xmlns:wp="http://schemas.openxmlformats.org/drawingml/2006/wordprocessingDrawing" xmlns:w10="urn:schemas-microsoft-com:office:word" xmlns:w="http://schemas.openxmlformats.org/wordprocessingml/2006/main" xmlns:w14="http://schemas.microsoft.com/office/word/2010/wordml" xmlns:w15="http://schemas.microsoft.com/office/word/2012/wordml" xmlns:w16cex="http://schemas.microsoft.com/office/word/2018/wordml/cex" xmlns:w16cid="http://schemas.microsoft.com/office/word/2016/wordml/cid" xmlns:w16="http://schemas.microsoft.com/office/word/2018/wordml" xmlns:w16sdtdh="http://schemas.microsoft.com/office/word/2020/wordml/sdtdatahash" xmlns:w16se="http://schemas.microsoft.com/office/word/2015/wordml/symex" xmlns:wpg="http://schemas.microsoft.com/office/word/2010/wordprocessingGroup" xmlns:wpi="http://schemas.microsoft.com/office/word/2010/wordprocessingInk" xmlns:wne="http://schemas.microsoft.com/office/word/2006/wordml" xmlns:wps="http://schemas.microsoft.com/office/word/2010/wordprocessingShape" mc:Ignorable="w14 w15 w16se w16cid w16 w16cex w16sdtdh wp14">
   <w:abstractNum w:abstractNumId="0" w15:restartNumberingAfterBreak="0">
     <w:nsid w:val="73166BEB"/>
     <w:multiLevelType w:val="multilevel"/>
@@ -2232,7 +2118,7 @@
 </file>
 
 <file path=word/styles.xml><?xml version="1.0" encoding="utf-8"?>
-<w:styles xmlns:mc="http://schemas.openxmlformats.org/markup-compatibility/2006" xmlns:r="http://schemas.openxmlformats.org/officeDocument/2006/relationships" xmlns:w="http://schemas.openxmlformats.org/wordprocessingml/2006/main" xmlns:w14="http://schemas.microsoft.com/office/word/2010/wordml" xmlns:w15="http://schemas.microsoft.com/office/word/2012/wordml" xmlns:w16se="http://schemas.microsoft.com/office/word/2015/wordml/symex" mc:Ignorable="w14 w15 w16se">
+<w:styles xmlns:mc="http://schemas.openxmlformats.org/markup-compatibility/2006" xmlns:r="http://schemas.openxmlformats.org/officeDocument/2006/relationships" xmlns:w="http://schemas.openxmlformats.org/wordprocessingml/2006/main" xmlns:w14="http://schemas.microsoft.com/office/word/2010/wordml" xmlns:w15="http://schemas.microsoft.com/office/word/2012/wordml" xmlns:w16cex="http://schemas.microsoft.com/office/word/2018/wordml/cex" xmlns:w16cid="http://schemas.microsoft.com/office/word/2016/wordml/cid" xmlns:w16="http://schemas.microsoft.com/office/word/2018/wordml" xmlns:w16sdtdh="http://schemas.microsoft.com/office/word/2020/wordml/sdtdatahash" xmlns:w16se="http://schemas.microsoft.com/office/word/2015/wordml/symex" mc:Ignorable="w14 w15 w16se w16cid w16 w16cex w16sdtdh">
   <w:docDefaults>
     <w:rPrDefault>
       <w:rPr>
@@ -2248,7 +2134,7 @@
       </w:pPr>
     </w:pPrDefault>
   </w:docDefaults>
-  <w:latentStyles w:defLockedState="0" w:defUIPriority="99" w:defSemiHidden="0" w:defUnhideWhenUsed="0" w:defQFormat="0" w:count="371">
+  <w:latentStyles w:defLockedState="0" w:defUIPriority="99" w:defSemiHidden="0" w:defUnhideWhenUsed="0" w:defQFormat="0" w:count="376">
     <w:lsdException w:name="Normal" w:uiPriority="0" w:qFormat="1"/>
     <w:lsdException w:name="heading 1" w:uiPriority="9" w:qFormat="1"/>
     <w:lsdException w:name="heading 2" w:semiHidden="1" w:uiPriority="9" w:unhideWhenUsed="1" w:qFormat="1"/>
@@ -2354,7 +2240,6 @@
     <w:lsdException w:name="HTML Sample" w:semiHidden="1" w:unhideWhenUsed="1"/>
     <w:lsdException w:name="HTML Typewriter" w:semiHidden="1" w:unhideWhenUsed="1"/>
     <w:lsdException w:name="HTML Variable" w:semiHidden="1" w:unhideWhenUsed="1"/>
-    <w:lsdException w:name="Normal Table" w:semiHidden="1" w:unhideWhenUsed="1"/>
     <w:lsdException w:name="annotation subject" w:semiHidden="1" w:unhideWhenUsed="1"/>
     <w:lsdException w:name="No List" w:semiHidden="1" w:unhideWhenUsed="1"/>
     <w:lsdException w:name="Outline List 1" w:semiHidden="1" w:unhideWhenUsed="1"/>
@@ -2397,11 +2282,8 @@
     <w:lsdException w:name="Table Contemporary" w:semiHidden="1" w:unhideWhenUsed="1"/>
     <w:lsdException w:name="Table Elegant" w:semiHidden="1" w:unhideWhenUsed="1"/>
     <w:lsdException w:name="Table Professional" w:semiHidden="1" w:unhideWhenUsed="1"/>
-    <w:lsdException w:name="Table Subtle 1" w:semiHidden="1" w:unhideWhenUsed="1"/>
     <w:lsdException w:name="Table Subtle 2" w:semiHidden="1" w:unhideWhenUsed="1"/>
     <w:lsdException w:name="Table Web 1" w:semiHidden="1" w:unhideWhenUsed="1"/>
-    <w:lsdException w:name="Table Web 2" w:semiHidden="1" w:unhideWhenUsed="1"/>
-    <w:lsdException w:name="Table Web 3" w:semiHidden="1" w:unhideWhenUsed="1"/>
     <w:lsdException w:name="Balloon Text" w:semiHidden="1" w:unhideWhenUsed="1"/>
     <w:lsdException w:name="Table Grid" w:uiPriority="39"/>
     <w:lsdException w:name="Table Theme" w:semiHidden="1" w:unhideWhenUsed="1"/>
@@ -2620,6 +2502,11 @@
     <w:lsdException w:name="List Table 5 Dark Accent 6" w:uiPriority="50"/>
     <w:lsdException w:name="List Table 6 Colorful Accent 6" w:uiPriority="51"/>
     <w:lsdException w:name="List Table 7 Colorful Accent 6" w:uiPriority="52"/>
+    <w:lsdException w:name="Mention" w:semiHidden="1" w:unhideWhenUsed="1"/>
+    <w:lsdException w:name="Smart Hyperlink" w:semiHidden="1" w:unhideWhenUsed="1"/>
+    <w:lsdException w:name="Hashtag" w:semiHidden="1" w:unhideWhenUsed="1"/>
+    <w:lsdException w:name="Unresolved Mention" w:semiHidden="1" w:unhideWhenUsed="1"/>
+    <w:lsdException w:name="Smart Link" w:semiHidden="1" w:unhideWhenUsed="1"/>
   </w:latentStyles>
   <w:style w:type="paragraph" w:default="1" w:styleId="Normal">
     <w:name w:val="Normal"/>
@@ -2776,7 +2663,7 @@
 </file>
 
 <file path=word/glossary/document.xml><?xml version="1.0" encoding="utf-8"?>
-<w:glossaryDocument xmlns:wpc="http://schemas.microsoft.com/office/word/2010/wordprocessingCanvas" xmlns:cx="http://schemas.microsoft.com/office/drawing/2014/chartex" xmlns:mc="http://schemas.openxmlformats.org/markup-compatibility/2006" xmlns:o="urn:schemas-microsoft-com:office:office" xmlns:r="http://schemas.openxmlformats.org/officeDocument/2006/relationships" xmlns:m="http://schemas.openxmlformats.org/officeDocument/2006/math" xmlns:v="urn:schemas-microsoft-com:vml" xmlns:wp14="http://schemas.microsoft.com/office/word/2010/wordprocessingDrawing" xmlns:wp="http://schemas.openxmlformats.org/drawingml/2006/wordprocessingDrawing" xmlns:w10="urn:schemas-microsoft-com:office:word" xmlns:w="http://schemas.openxmlformats.org/wordprocessingml/2006/main" xmlns:w14="http://schemas.microsoft.com/office/word/2010/wordml" xmlns:w15="http://schemas.microsoft.com/office/word/2012/wordml" xmlns:w16se="http://schemas.microsoft.com/office/word/2015/wordml/symex" xmlns:wpg="http://schemas.microsoft.com/office/word/2010/wordprocessingGroup" xmlns:wpi="http://schemas.microsoft.com/office/word/2010/wordprocessingInk" xmlns:wne="http://schemas.microsoft.com/office/word/2006/wordml" xmlns:wps="http://schemas.microsoft.com/office/word/2010/wordprocessingShape" mc:Ignorable="w14 w15 w16se wp14">
+<w:glossaryDocument xmlns:wpc="http://schemas.microsoft.com/office/word/2010/wordprocessingCanvas" xmlns:cx="http://schemas.microsoft.com/office/drawing/2014/chartex" xmlns:cx1="http://schemas.microsoft.com/office/drawing/2015/9/8/chartex" xmlns:cx2="http://schemas.microsoft.com/office/drawing/2015/10/21/chartex" xmlns:cx3="http://schemas.microsoft.com/office/drawing/2016/5/9/chartex" xmlns:cx4="http://schemas.microsoft.com/office/drawing/2016/5/10/chartex" xmlns:cx5="http://schemas.microsoft.com/office/drawing/2016/5/11/chartex" xmlns:cx6="http://schemas.microsoft.com/office/drawing/2016/5/12/chartex" xmlns:cx7="http://schemas.microsoft.com/office/drawing/2016/5/13/chartex" xmlns:cx8="http://schemas.microsoft.com/office/drawing/2016/5/14/chartex" xmlns:mc="http://schemas.openxmlformats.org/markup-compatibility/2006" xmlns:aink="http://schemas.microsoft.com/office/drawing/2016/ink" xmlns:am3d="http://schemas.microsoft.com/office/drawing/2017/model3d" xmlns:o="urn:schemas-microsoft-com:office:office" xmlns:r="http://schemas.openxmlformats.org/officeDocument/2006/relationships" xmlns:m="http://schemas.openxmlformats.org/officeDocument/2006/math" xmlns:v="urn:schemas-microsoft-com:vml" xmlns:wp14="http://schemas.microsoft.com/office/word/2010/wordprocessingDrawing" xmlns:wp="http://schemas.openxmlformats.org/drawingml/2006/wordprocessingDrawing" xmlns:w10="urn:schemas-microsoft-com:office:word" xmlns:w="http://schemas.openxmlformats.org/wordprocessingml/2006/main" xmlns:w14="http://schemas.microsoft.com/office/word/2010/wordml" xmlns:w15="http://schemas.microsoft.com/office/word/2012/wordml" xmlns:w16cex="http://schemas.microsoft.com/office/word/2018/wordml/cex" xmlns:w16cid="http://schemas.microsoft.com/office/word/2016/wordml/cid" xmlns:w16="http://schemas.microsoft.com/office/word/2018/wordml" xmlns:w16sdtdh="http://schemas.microsoft.com/office/word/2020/wordml/sdtdatahash" xmlns:w16se="http://schemas.microsoft.com/office/word/2015/wordml/symex" xmlns:wpg="http://schemas.microsoft.com/office/word/2010/wordprocessingGroup" xmlns:wpi="http://schemas.microsoft.com/office/word/2010/wordprocessingInk" xmlns:wne="http://schemas.microsoft.com/office/word/2006/wordml" xmlns:wps="http://schemas.microsoft.com/office/word/2010/wordprocessingShape" mc:Ignorable="w14 w15 w16se w16cid w16 w16cex w16sdtdh wp14">
   <w:docParts>
     <w:docPart>
       <w:docPartPr>
@@ -2809,7 +2696,7 @@
 </file>
 
 <file path=word/glossary/fontTable.xml><?xml version="1.0" encoding="utf-8"?>
-<w:fonts xmlns:mc="http://schemas.openxmlformats.org/markup-compatibility/2006" xmlns:r="http://schemas.openxmlformats.org/officeDocument/2006/relationships" xmlns:w="http://schemas.openxmlformats.org/wordprocessingml/2006/main" xmlns:w14="http://schemas.microsoft.com/office/word/2010/wordml" xmlns:w15="http://schemas.microsoft.com/office/word/2012/wordml" xmlns:w16se="http://schemas.microsoft.com/office/word/2015/wordml/symex" mc:Ignorable="w14 w15 w16se">
+<w:fonts xmlns:mc="http://schemas.openxmlformats.org/markup-compatibility/2006" xmlns:r="http://schemas.openxmlformats.org/officeDocument/2006/relationships" xmlns:w="http://schemas.openxmlformats.org/wordprocessingml/2006/main" xmlns:w14="http://schemas.microsoft.com/office/word/2010/wordml" xmlns:w15="http://schemas.microsoft.com/office/word/2012/wordml" xmlns:w16cex="http://schemas.microsoft.com/office/word/2018/wordml/cex" xmlns:w16cid="http://schemas.microsoft.com/office/word/2016/wordml/cid" xmlns:w16="http://schemas.microsoft.com/office/word/2018/wordml" xmlns:w16sdtdh="http://schemas.microsoft.com/office/word/2020/wordml/sdtdatahash" xmlns:w16se="http://schemas.microsoft.com/office/word/2015/wordml/symex" mc:Ignorable="w14 w15 w16se w16cid w16 w16cex w16sdtdh">
   <w:font w:name="Symbol">
     <w:panose1 w:val="05050102010706020507"/>
     <w:charset w:val="02"/>
@@ -2843,14 +2730,30 @@
     <w:charset w:val="00"/>
     <w:family w:val="swiss"/>
     <w:pitch w:val="variable"/>
-    <w:sig w:usb0="E4002EFF" w:usb1="C000247B" w:usb2="00000009" w:usb3="00000000" w:csb0="000001FF" w:csb1="00000000"/>
+    <w:sig w:usb0="E4002EFF" w:usb1="C200247B" w:usb2="00000009" w:usb3="00000000" w:csb0="000001FF" w:csb1="00000000"/>
   </w:font>
   <w:font w:name="Calibri Light">
     <w:panose1 w:val="020F0302020204030204"/>
     <w:charset w:val="00"/>
     <w:family w:val="swiss"/>
     <w:pitch w:val="variable"/>
-    <w:sig w:usb0="E4002EFF" w:usb1="C000247B" w:usb2="00000009" w:usb3="00000000" w:csb0="000001FF" w:csb1="00000000"/>
+    <w:sig w:usb0="E4002EFF" w:usb1="C200247B" w:usb2="00000009" w:usb3="00000000" w:csb0="000001FF" w:csb1="00000000"/>
+  </w:font>
+  <w:font w:name="DengXian Light">
+    <w:altName w:val="等线 Light"/>
+    <w:panose1 w:val="02010600030101010101"/>
+    <w:charset w:val="86"/>
+    <w:family w:val="auto"/>
+    <w:pitch w:val="variable"/>
+    <w:sig w:usb0="A00002BF" w:usb1="38CF7CFA" w:usb2="00000016" w:usb3="00000000" w:csb0="0004000F" w:csb1="00000000"/>
+  </w:font>
+  <w:font w:name="DengXian">
+    <w:altName w:val="等线"/>
+    <w:panose1 w:val="02010600030101010101"/>
+    <w:charset w:val="86"/>
+    <w:family w:val="auto"/>
+    <w:pitch w:val="variable"/>
+    <w:sig w:usb0="A00002BF" w:usb1="38CF7CFA" w:usb2="00000016" w:usb3="00000000" w:csb0="0004000F" w:csb1="00000000"/>
   </w:font>
   <w:font w:name="Century Gothic">
     <w:panose1 w:val="020B0502020202020204"/>
@@ -2863,7 +2766,7 @@
 </file>
 
 <file path=word/glossary/settings.xml><?xml version="1.0" encoding="utf-8"?>
-<w:settings xmlns:mc="http://schemas.openxmlformats.org/markup-compatibility/2006" xmlns:o="urn:schemas-microsoft-com:office:office" xmlns:r="http://schemas.openxmlformats.org/officeDocument/2006/relationships" xmlns:m="http://schemas.openxmlformats.org/officeDocument/2006/math" xmlns:v="urn:schemas-microsoft-com:vml" xmlns:w10="urn:schemas-microsoft-com:office:word" xmlns:w="http://schemas.openxmlformats.org/wordprocessingml/2006/main" xmlns:w14="http://schemas.microsoft.com/office/word/2010/wordml" xmlns:w15="http://schemas.microsoft.com/office/word/2012/wordml" xmlns:w16se="http://schemas.microsoft.com/office/word/2015/wordml/symex" xmlns:sl="http://schemas.openxmlformats.org/schemaLibrary/2006/main" mc:Ignorable="w14 w15 w16se">
+<w:settings xmlns:mc="http://schemas.openxmlformats.org/markup-compatibility/2006" xmlns:o="urn:schemas-microsoft-com:office:office" xmlns:r="http://schemas.openxmlformats.org/officeDocument/2006/relationships" xmlns:m="http://schemas.openxmlformats.org/officeDocument/2006/math" xmlns:v="urn:schemas-microsoft-com:vml" xmlns:w10="urn:schemas-microsoft-com:office:word" xmlns:w="http://schemas.openxmlformats.org/wordprocessingml/2006/main" xmlns:w14="http://schemas.microsoft.com/office/word/2010/wordml" xmlns:w15="http://schemas.microsoft.com/office/word/2012/wordml" xmlns:w16cex="http://schemas.microsoft.com/office/word/2018/wordml/cex" xmlns:w16cid="http://schemas.microsoft.com/office/word/2016/wordml/cid" xmlns:w16="http://schemas.microsoft.com/office/word/2018/wordml" xmlns:w16sdtdh="http://schemas.microsoft.com/office/word/2020/wordml/sdtdatahash" xmlns:w16se="http://schemas.microsoft.com/office/word/2015/wordml/symex" xmlns:sl="http://schemas.openxmlformats.org/schemaLibrary/2006/main" mc:Ignorable="w14 w15 w16se w16cid w16 w16cex w16sdtdh">
   <w:view w:val="normal"/>
   <w:defaultTabStop w:val="708"/>
   <w:hyphenationZone w:val="425"/>
@@ -2875,6 +2778,7 @@
     <w:compatSetting w:name="enableOpenTypeFeatures" w:uri="http://schemas.microsoft.com/office/word" w:val="1"/>
     <w:compatSetting w:name="doNotFlipMirrorIndents" w:uri="http://schemas.microsoft.com/office/word" w:val="1"/>
     <w:compatSetting w:name="differentiateMultirowTableHeaders" w:uri="http://schemas.microsoft.com/office/word" w:val="1"/>
+    <w:compatSetting w:name="useWord2013TrackBottomHyphenation" w:uri="http://schemas.microsoft.com/office/word" w:val="1"/>
   </w:compat>
   <w:rsids>
     <w:rsidRoot w:val="00AF0DB4"/>
@@ -2890,6 +2794,7 @@
     <w:rsid w:val="00A3537C"/>
     <w:rsid w:val="00AF0DB4"/>
     <w:rsid w:val="00B83418"/>
+    <w:rsid w:val="00E85F6E"/>
   </w:rsids>
   <m:mathPr>
     <m:mathFont m:val="Cambria Math"/>
@@ -2904,7 +2809,7 @@
     <m:intLim m:val="subSup"/>
     <m:naryLim m:val="undOvr"/>
   </m:mathPr>
-  <w:themeFontLang w:val="es-ES"/>
+  <w:themeFontLang w:val="es-ES" w:eastAsia="zh-CN"/>
   <w:clrSchemeMapping w:bg1="light1" w:t1="dark1" w:bg2="light2" w:t2="dark2" w:accent1="accent1" w:accent2="accent2" w:accent3="accent3" w:accent4="accent4" w:accent5="accent5" w:accent6="accent6" w:hyperlink="hyperlink" w:followedHyperlink="followedHyperlink"/>
   <w:decimalSymbol w:val=","/>
   <w:listSeparator w:val=";"/>
@@ -2913,7 +2818,7 @@
 </file>
 
 <file path=word/glossary/styles.xml><?xml version="1.0" encoding="utf-8"?>
-<w:styles xmlns:mc="http://schemas.openxmlformats.org/markup-compatibility/2006" xmlns:r="http://schemas.openxmlformats.org/officeDocument/2006/relationships" xmlns:w="http://schemas.openxmlformats.org/wordprocessingml/2006/main" xmlns:w14="http://schemas.microsoft.com/office/word/2010/wordml" xmlns:w15="http://schemas.microsoft.com/office/word/2012/wordml" xmlns:w16se="http://schemas.microsoft.com/office/word/2015/wordml/symex" mc:Ignorable="w14 w15 w16se">
+<w:styles xmlns:mc="http://schemas.openxmlformats.org/markup-compatibility/2006" xmlns:r="http://schemas.openxmlformats.org/officeDocument/2006/relationships" xmlns:w="http://schemas.openxmlformats.org/wordprocessingml/2006/main" xmlns:w14="http://schemas.microsoft.com/office/word/2010/wordml" xmlns:w15="http://schemas.microsoft.com/office/word/2012/wordml" xmlns:w16cex="http://schemas.microsoft.com/office/word/2018/wordml/cex" xmlns:w16cid="http://schemas.microsoft.com/office/word/2016/wordml/cid" xmlns:w16="http://schemas.microsoft.com/office/word/2018/wordml" xmlns:w16sdtdh="http://schemas.microsoft.com/office/word/2020/wordml/sdtdatahash" xmlns:w16se="http://schemas.microsoft.com/office/word/2015/wordml/symex" mc:Ignorable="w14 w15 w16se w16cid w16 w16cex w16sdtdh">
   <w:docDefaults>
     <w:rPrDefault>
       <w:rPr>
@@ -2929,7 +2834,7 @@
       </w:pPr>
     </w:pPrDefault>
   </w:docDefaults>
-  <w:latentStyles w:defLockedState="0" w:defUIPriority="99" w:defSemiHidden="0" w:defUnhideWhenUsed="0" w:defQFormat="0" w:count="371">
+  <w:latentStyles w:defLockedState="0" w:defUIPriority="99" w:defSemiHidden="0" w:defUnhideWhenUsed="0" w:defQFormat="0" w:count="376">
     <w:lsdException w:name="Normal" w:uiPriority="0" w:qFormat="1"/>
     <w:lsdException w:name="heading 1" w:uiPriority="9" w:qFormat="1"/>
     <w:lsdException w:name="heading 2" w:semiHidden="1" w:uiPriority="9" w:unhideWhenUsed="1" w:qFormat="1"/>
@@ -3035,7 +2940,6 @@
     <w:lsdException w:name="HTML Sample" w:semiHidden="1" w:unhideWhenUsed="1"/>
     <w:lsdException w:name="HTML Typewriter" w:semiHidden="1" w:unhideWhenUsed="1"/>
     <w:lsdException w:name="HTML Variable" w:semiHidden="1" w:unhideWhenUsed="1"/>
-    <w:lsdException w:name="Normal Table" w:semiHidden="1" w:unhideWhenUsed="1"/>
     <w:lsdException w:name="annotation subject" w:semiHidden="1" w:unhideWhenUsed="1"/>
     <w:lsdException w:name="No List" w:semiHidden="1" w:unhideWhenUsed="1"/>
     <w:lsdException w:name="Outline List 1" w:semiHidden="1" w:unhideWhenUsed="1"/>
@@ -3078,11 +2982,8 @@
     <w:lsdException w:name="Table Contemporary" w:semiHidden="1" w:unhideWhenUsed="1"/>
     <w:lsdException w:name="Table Elegant" w:semiHidden="1" w:unhideWhenUsed="1"/>
     <w:lsdException w:name="Table Professional" w:semiHidden="1" w:unhideWhenUsed="1"/>
-    <w:lsdException w:name="Table Subtle 1" w:semiHidden="1" w:unhideWhenUsed="1"/>
     <w:lsdException w:name="Table Subtle 2" w:semiHidden="1" w:unhideWhenUsed="1"/>
     <w:lsdException w:name="Table Web 1" w:semiHidden="1" w:unhideWhenUsed="1"/>
-    <w:lsdException w:name="Table Web 2" w:semiHidden="1" w:unhideWhenUsed="1"/>
-    <w:lsdException w:name="Table Web 3" w:semiHidden="1" w:unhideWhenUsed="1"/>
     <w:lsdException w:name="Balloon Text" w:semiHidden="1" w:unhideWhenUsed="1"/>
     <w:lsdException w:name="Table Grid" w:uiPriority="39"/>
     <w:lsdException w:name="Table Theme" w:semiHidden="1" w:unhideWhenUsed="1"/>
@@ -3301,6 +3202,11 @@
     <w:lsdException w:name="List Table 5 Dark Accent 6" w:uiPriority="50"/>
     <w:lsdException w:name="List Table 6 Colorful Accent 6" w:uiPriority="51"/>
     <w:lsdException w:name="List Table 7 Colorful Accent 6" w:uiPriority="52"/>
+    <w:lsdException w:name="Mention" w:semiHidden="1" w:unhideWhenUsed="1"/>
+    <w:lsdException w:name="Smart Hyperlink" w:semiHidden="1" w:unhideWhenUsed="1"/>
+    <w:lsdException w:name="Hashtag" w:semiHidden="1" w:unhideWhenUsed="1"/>
+    <w:lsdException w:name="Unresolved Mention" w:semiHidden="1" w:unhideWhenUsed="1"/>
+    <w:lsdException w:name="Smart Link" w:semiHidden="1" w:unhideWhenUsed="1"/>
   </w:latentStyles>
   <w:style w:type="paragraph" w:default="1" w:styleId="Normal">
     <w:name w:val="Normal"/>
@@ -3343,35 +3249,11 @@
       <w:color w:val="808080"/>
     </w:rPr>
   </w:style>
-  <w:style w:type="paragraph" w:customStyle="1" w:styleId="4CB5BBBA54E44FE39D77C73079136078">
-    <w:name w:val="4CB5BBBA54E44FE39D77C73079136078"/>
-    <w:rsid w:val="004F1033"/>
-    <w:pPr>
-      <w:spacing w:before="100" w:beforeAutospacing="1" w:after="100" w:afterAutospacing="1" w:line="240" w:lineRule="auto"/>
-    </w:pPr>
-    <w:rPr>
-      <w:rFonts w:ascii="Times New Roman" w:eastAsia="Times New Roman" w:hAnsi="Times New Roman" w:cs="Times New Roman"/>
-      <w:sz w:val="24"/>
-      <w:szCs w:val="24"/>
-    </w:rPr>
-  </w:style>
-  <w:style w:type="paragraph" w:customStyle="1" w:styleId="4CB5BBBA54E44FE39D77C730791360781">
-    <w:name w:val="4CB5BBBA54E44FE39D77C730791360781"/>
-    <w:rsid w:val="004F1033"/>
-    <w:pPr>
-      <w:spacing w:before="100" w:beforeAutospacing="1" w:after="100" w:afterAutospacing="1" w:line="240" w:lineRule="auto"/>
-    </w:pPr>
-    <w:rPr>
-      <w:rFonts w:ascii="Times New Roman" w:eastAsia="Times New Roman" w:hAnsi="Times New Roman" w:cs="Times New Roman"/>
-      <w:sz w:val="24"/>
-      <w:szCs w:val="24"/>
-    </w:rPr>
-  </w:style>
 </w:styles>
 </file>
 
 <file path=word/glossary/webSettings.xml><?xml version="1.0" encoding="utf-8"?>
-<w:webSettings xmlns:mc="http://schemas.openxmlformats.org/markup-compatibility/2006" xmlns:r="http://schemas.openxmlformats.org/officeDocument/2006/relationships" xmlns:w="http://schemas.openxmlformats.org/wordprocessingml/2006/main" xmlns:w14="http://schemas.microsoft.com/office/word/2010/wordml" xmlns:w15="http://schemas.microsoft.com/office/word/2012/wordml" xmlns:w16se="http://schemas.microsoft.com/office/word/2015/wordml/symex" mc:Ignorable="w14 w15 w16se">
+<w:webSettings xmlns:mc="http://schemas.openxmlformats.org/markup-compatibility/2006" xmlns:r="http://schemas.openxmlformats.org/officeDocument/2006/relationships" xmlns:w="http://schemas.openxmlformats.org/wordprocessingml/2006/main" xmlns:w14="http://schemas.microsoft.com/office/word/2010/wordml" xmlns:w15="http://schemas.microsoft.com/office/word/2012/wordml" xmlns:w16cex="http://schemas.microsoft.com/office/word/2018/wordml/cex" xmlns:w16cid="http://schemas.microsoft.com/office/word/2016/wordml/cid" xmlns:w16="http://schemas.microsoft.com/office/word/2018/wordml" xmlns:w16sdtdh="http://schemas.microsoft.com/office/word/2020/wordml/sdtdatahash" xmlns:w16se="http://schemas.microsoft.com/office/word/2015/wordml/symex" mc:Ignorable="w14 w15 w16se w16cid w16 w16cex w16sdtdh">
   <w:optimizeForBrowser/>
   <w:allowPNG/>
 </w:webSettings>

</xml_diff>